<commit_message>
Improve paper figures with evidence panels and editable process diagrams
</commit_message>
<xml_diff>
--- a/paper/补齐约束.docx
+++ b/paper/补齐约束.docx
@@ -3485,20 +3485,20 @@
           <w:rFonts w:ascii="宋体" w:hAnsi="宋体" w:eastAsia="宋体"/>
           <w:sz w:val="21"/>
         </w:rPr>
-        <w:t xml:space="preserve">四个子问题面对同一套物理设备，因而共享同一组决策量、状态量与储能约束，差别只落在"信息何时可用"与"偏差如何计费"上。本章先建立这一公共内核，后续各问只描述其增量，避免整套模型的重复粘贴。全文的技术路线如图 1 所示。</w:t>
+        <w:t>四个子问题面对同一套物理设备，因而共享同一组决策量、状态量与储能约束，差别只落在"信息何时可用"与"偏差如何计费"上。本章先建立这一公共内核，后续各问只描述其增量，避免整套模型的重复粘贴。全文的技术路线如图 1 所示。</w:t>
       </w:r>
     </w:p>
     <w:p>
       <w:pPr>
-        <w:keepNext/>
+        <w:keepNext w:val="1"/>
         <w:ind w:firstLine="0"/>
         <w:jc w:val="center"/>
       </w:pPr>
       <w:r>
         <w:drawing>
           <wp:inline xmlns:a="http://schemas.openxmlformats.org/drawingml/2006/main" xmlns:pic="http://schemas.openxmlformats.org/drawingml/2006/picture">
-            <wp:extent cx="5595815" cy="3264225"/>
-            <wp:docPr id="1" name="Picture 1"/>
+            <wp:extent cx="5400000" cy="2737500"/>
+            <wp:docPr id="1" name="Picture 1" descr="统一线性规划内核支撑四个递进子问题"/>
             <wp:cNvGraphicFramePr>
               <a:graphicFrameLocks noChangeAspect="1"/>
             </wp:cNvGraphicFramePr>
@@ -3518,7 +3518,7 @@
                   <pic:spPr>
                     <a:xfrm>
                       <a:off x="0" y="0"/>
-                      <a:ext cx="5595815" cy="3264225"/>
+                      <a:ext cx="5400000" cy="2737500"/>
                     </a:xfrm>
                     <a:prstGeom prst="rect"/>
                   </pic:spPr>
@@ -3541,7 +3541,7 @@
           <w:rFonts w:ascii="宋体" w:hAnsi="宋体" w:eastAsia="宋体"/>
           <w:sz w:val="18"/>
         </w:rPr>
-        <w:t xml:space="preserve">图 1 全文技术路线</w:t>
+        <w:t>图 1 全文技术路线</w:t>
       </w:r>
     </w:p>
     <w:p>
@@ -3551,7 +3551,7 @@
           <w:rFonts w:ascii="宋体" w:hAnsi="宋体" w:eastAsia="宋体"/>
           <w:sz w:val="21"/>
         </w:rPr>
-        <w:t xml:space="preserve">图 1 从数据诊断出发，将附件关系、周内日型与预报信息边界汇入共用线性规划内核，再分出四个问题的决策分支。各分支共享能量平衡、储能递推及边界约束，而在信息到达时刻和费用规则上有所不同；最后按各自计法结算并回算导出结果。因此，下文先给出共用内核，再分别说明每问新增的决策与信息。</w:t>
+        <w:t>图 1 按“可用信息—决策方法—输出与比较”组织四问。问题一使用典型日完整信息；问题二锁定日前购电计划，再按实际量因果执行；问题三用日内新预报重优化尚未发生的时段；问题四改变电价与信息设定。四条路径共用储能物理约束，但各自的计划器和费用口径不同，结果按对应基线分别比较。</w:t>
       </w:r>
     </w:p>
     <w:p>
@@ -4381,7 +4381,7 @@
           <w:rFonts w:ascii="Times New Roman" w:eastAsia="宋体"/>
           <w:sz w:val="22"/>
         </w:rPr>
-        <w:t>图 2 将式 (2)–(3) 的变量落在实际能量流上。充放电量均按交流侧计量，效率作用于储能侧；图中的单段功率折算上限与下一节运行约束一致。</w:t>
+        <w:t>图 2 把式 (2)–(3) 的变量对应到母线能量流。所有箭头标注均为单段电量；充放电按交流侧计量，效率在储能侧起作用。问题一令紧急购电为零，后续各问再按各自费用规则计入该项。</w:t>
       </w:r>
     </w:p>
     <w:p>
@@ -4393,8 +4393,8 @@
       <w:r>
         <w:drawing>
           <wp:inline xmlns:a="http://schemas.openxmlformats.org/drawingml/2006/main" xmlns:pic="http://schemas.openxmlformats.org/drawingml/2006/picture">
-            <wp:extent cx="5400000" cy="2250000"/>
-            <wp:docPr id="25" name="fig_energy_flow" descr="交流母线能量流与储能效率作用位置"/>
+            <wp:extent cx="5400000" cy="2062500"/>
+            <wp:docPr id="25" name="Picture 1" descr="交流母线收支与效率作用位置"/>
             <wp:cNvGraphicFramePr>
               <a:graphicFrameLocks noChangeAspect="1"/>
             </wp:cNvGraphicFramePr>
@@ -4406,7 +4406,7 @@
                     <pic:cNvPicPr/>
                   </pic:nvPicPr>
                   <pic:blipFill>
-                    <a:blip r:embed="rIdV3Figure2"/>
+                    <a:blip r:embed="rIdRefresh2"/>
                     <a:stretch>
                       <a:fillRect/>
                     </a:stretch>
@@ -4414,7 +4414,7 @@
                   <pic:spPr>
                     <a:xfrm>
                       <a:off x="0" y="0"/>
-                      <a:ext cx="5400000" cy="2250000"/>
+                      <a:ext cx="5400000" cy="2062500"/>
                     </a:xfrm>
                     <a:prstGeom prst="rect"/>
                   </pic:spPr>
@@ -4431,14 +4431,13 @@
         <w:spacing w:after="100"/>
         <w:ind w:firstLine="0"/>
         <w:jc w:val="center"/>
-        <w:keepNext w:val="0"/>
       </w:pPr>
       <w:r>
         <w:rPr>
           <w:rFonts w:ascii="Times New Roman" w:eastAsia="宋体"/>
           <w:sz w:val="20"/>
         </w:rPr>
-        <w:t>图 2 交流母线能量流与储能效率作用位置</w:t>
+        <w:t>图 2 母线能量流与储能效率</w:t>
       </w:r>
     </w:p>
     <w:p>
@@ -5284,15 +5283,15 @@
     </w:p>
     <w:p>
       <w:pPr>
-        <w:keepNext/>
+        <w:keepNext w:val="1"/>
         <w:ind w:firstLine="0"/>
         <w:jc w:val="center"/>
       </w:pPr>
       <w:r>
         <w:drawing>
           <wp:inline xmlns:a="http://schemas.openxmlformats.org/drawingml/2006/main" xmlns:pic="http://schemas.openxmlformats.org/drawingml/2006/picture">
-            <wp:extent cx="4200798" cy="3948750"/>
-            <wp:docPr id="2" name="Picture 2"/>
+            <wp:extent cx="5400000" cy="4066420"/>
+            <wp:docPr id="2" name="Picture 2" descr="附件具有稳定的日内型与清晰的峰谷时段"/>
             <wp:cNvGraphicFramePr>
               <a:graphicFrameLocks noChangeAspect="1"/>
             </wp:cNvGraphicFramePr>
@@ -5312,7 +5311,7 @@
                   <pic:spPr>
                     <a:xfrm>
                       <a:off x="0" y="0"/>
-                      <a:ext cx="4200798" cy="3948750"/>
+                      <a:ext cx="5400000" cy="4066420"/>
                     </a:xfrm>
                     <a:prstGeom prst="rect"/>
                   </pic:spPr>
@@ -5335,7 +5334,7 @@
           <w:rFonts w:ascii="宋体" w:hAnsi="宋体" w:eastAsia="宋体"/>
           <w:sz w:val="18"/>
         </w:rPr>
-        <w:t xml:space="preserve">图 3 附件一平均日断面</w:t>
+        <w:t>图 3 附件一平均日断面</w:t>
       </w:r>
     </w:p>
     <w:p>
@@ -5392,12 +5391,12 @@
           <w:rFonts w:ascii="宋体" w:hAnsi="宋体" w:eastAsia="宋体"/>
           <w:sz w:val="21"/>
         </w:rPr>
-        <w:t xml:space="preserve">附件 2 全年 365 天的日用电量并非连续分布，而是清晰地分成高、低两簇。图 4 按星期把每日总量画成核密度山脊图，可以看到周五、周六两条曲线整体左移、与其余五天几乎不重叠。</w:t>
+        <w:t>附件 2 全年 365 天的日用电量并非连续分布，而是清晰地分成高、低两簇。图 4 按星期把每日总量画成核密度山脊图，可以看到周五、周六两条曲线整体左移、与其余五天几乎不重叠。</w:t>
       </w:r>
     </w:p>
     <w:p>
       <w:pPr>
-        <w:keepNext/>
+        <w:keepNext w:val="1"/>
         <w:ind w:firstLine="0"/>
         <w:jc w:val="center"/>
       </w:pPr>
@@ -5405,7 +5404,7 @@
         <w:drawing>
           <wp:inline xmlns:a="http://schemas.openxmlformats.org/drawingml/2006/main" xmlns:pic="http://schemas.openxmlformats.org/drawingml/2006/picture">
             <wp:extent cx="5265000" cy="3510000"/>
-            <wp:docPr id="3" name="Picture 3"/>
+            <wp:docPr id="3" name="Picture 3" descr="负载日型存在可分的双制度结构"/>
             <wp:cNvGraphicFramePr>
               <a:graphicFrameLocks noChangeAspect="1"/>
             </wp:cNvGraphicFramePr>
@@ -5448,7 +5447,7 @@
           <w:rFonts w:ascii="宋体" w:hAnsi="宋体" w:eastAsia="宋体"/>
           <w:sz w:val="18"/>
         </w:rPr>
-        <w:t xml:space="preserve">图 4 日用电量按星期分布</w:t>
+        <w:t>图 4 日用电量按星期分布</w:t>
       </w:r>
     </w:p>
     <w:p>
@@ -5458,12 +5457,12 @@
           <w:rFonts w:ascii="宋体" w:hAnsi="宋体" w:eastAsia="宋体"/>
           <w:sz w:val="21"/>
         </w:rPr>
-        <w:t xml:space="preserve">统计上，周五与周六合计 104 天构成低负载日型，日均用电 78369.5 kWh；其余五天合计 261 天构成高负载日型，日均 124036.9 kWh，两者相差约 58%。图 4 中低负载两簇的峰位落在 7.5 万 kWh 附近，高负载五簇的峰位落在 12 万 kWh 附近，簇内方差远小于簇间距离，因此用"是否周五/周六"就能几乎无误地判定日型。这一结构对建模的意义是决定性的：若用全历史平均预测某个低负载日的负载，会系统性高估约 4.5 万 kWh；反之亦然。因此后文所有负载预测都先按日型分组，再在组内取近期历史均值，而不能跨组混用。日历热图（图 5）进一步验证这一结构不是偶然的月度波动。</w:t>
+        <w:t>统计上，周五与周六合计 104 天构成低负载日型，日均用电 78369.5 kWh；其余五天合计 261 天构成高负载日型，日均 124036.9 kWh，两者相差约 58%。图 4 中低负载两簇的峰位落在 7.5 万 kWh 附近，高负载五簇的峰位落在 12 万 kWh 附近，簇内方差远小于簇间距离，因此用"是否周五/周六"就能几乎无误地判定日型。这一结构对建模的意义是决定性的：若用全历史平均预测某个低负载日的负载，会系统性高估约 4.5 万 kWh；反之亦然。因此后文所有负载预测都先按日型分组，再在组内取近期历史均值，而不能跨组混用。日历热图（图 5）进一步验证这一结构不是偶然的月度波动。</w:t>
       </w:r>
     </w:p>
     <w:p>
       <w:pPr>
-        <w:keepNext/>
+        <w:keepNext w:val="1"/>
         <w:ind w:firstLine="0"/>
         <w:jc w:val="center"/>
       </w:pPr>
@@ -5471,7 +5470,7 @@
         <w:drawing>
           <wp:inline xmlns:a="http://schemas.openxmlformats.org/drawingml/2006/main" xmlns:pic="http://schemas.openxmlformats.org/drawingml/2006/picture">
             <wp:extent cx="5264999" cy="2411871"/>
-            <wp:docPr id="4" name="Picture 4"/>
+            <wp:docPr id="4" name="Picture 4" descr="高低载制度在日历上呈稳定块状切换"/>
             <wp:cNvGraphicFramePr>
               <a:graphicFrameLocks noChangeAspect="1"/>
             </wp:cNvGraphicFramePr>
@@ -5514,7 +5513,7 @@
           <w:rFonts w:ascii="宋体" w:hAnsi="宋体" w:eastAsia="宋体"/>
           <w:sz w:val="18"/>
         </w:rPr>
-        <w:t xml:space="preserve">图 5 全年日用电量日历热图</w:t>
+        <w:t>图 5 全年日用电量日历热图</w:t>
       </w:r>
     </w:p>
     <w:p>
@@ -5524,7 +5523,7 @@
           <w:rFonts w:ascii="宋体" w:hAnsi="宋体" w:eastAsia="宋体"/>
           <w:sz w:val="21"/>
         </w:rPr>
-        <w:t xml:space="preserve">以周为列、星期为行铺开全年日用电量（图 5），颜色越深表示用电越多。周五、周六两行贯穿全年系统性偏浅，青色线标出的这两行在全年各周内几乎没有例外，证实低负载日型与星期强绑定而非随机噪声。沿横向还可读出季节趋势：7–8 月整体偏深，对应夏季空调负荷抬升，月均日用电从 3 月的约 10.5 万 kWh 升到 7 月的约 12.8 万 kWh。这一季节漂移说明负载预测除了分日型，还应偏重"近期"历史而非远期，为后文取最近 4 天均值提供了依据，因为预测窗口过长会把已经过去的季节状态带进来。</w:t>
+        <w:t>以周为列、星期为行铺开全年日用电量（图 5），颜色越深表示用电越多。周五、周六两行贯穿全年系统性偏浅，青色线标出的这两行在全年各周内几乎没有例外，证实低负载日型与星期强绑定而非随机噪声。沿横向还可读出季节趋势：7–8 月整体偏深，对应夏季空调负荷抬升，月均日用电从 3 月的约 10.5 万 kWh 升到 7 月的约 12.8 万 kWh。这一季节漂移说明负载预测除了分日型，还应偏重"近期"历史而非远期，为后文取最近 4 天均值提供了依据，因为预测窗口过长会把已经过去的季节状态带进来。</w:t>
       </w:r>
     </w:p>
     <w:p>
@@ -5547,12 +5546,12 @@
           <w:rFonts w:ascii="宋体" w:hAnsi="宋体" w:eastAsia="宋体"/>
           <w:sz w:val="21"/>
         </w:rPr>
-        <w:t xml:space="preserve">一个自然的猜想是：低负载日只是高负载日按某个固定比例缩小。若成立，则只需估计一条形状曲线加一个总量系数即可。图 6 用两日型的日内平均负载形状与逐段比值否定了这一简化。</w:t>
+        <w:t>一个自然的猜想是：低负载日只是高负载日按某个固定比例缩小。若成立，则只需估计一条形状曲线加一个总量系数即可。图 6 用两日型的日内平均负载形状与逐段比值否定了这一简化。</w:t>
       </w:r>
     </w:p>
     <w:p>
       <w:pPr>
-        <w:keepNext/>
+        <w:keepNext w:val="1"/>
         <w:ind w:firstLine="0"/>
         <w:jc w:val="center"/>
       </w:pPr>
@@ -5560,7 +5559,7 @@
         <w:drawing>
           <wp:inline xmlns:a="http://schemas.openxmlformats.org/drawingml/2006/main" xmlns:pic="http://schemas.openxmlformats.org/drawingml/2006/picture">
             <wp:extent cx="5265000" cy="2983500"/>
-            <wp:docPr id="5" name="Picture 5"/>
+            <wp:docPr id="5" name="Picture 5" descr="高载型不仅水平更高，峰段形状也不同"/>
             <wp:cNvGraphicFramePr>
               <a:graphicFrameLocks noChangeAspect="1"/>
             </wp:cNvGraphicFramePr>
@@ -5603,7 +5602,7 @@
           <w:rFonts w:ascii="宋体" w:hAnsi="宋体" w:eastAsia="宋体"/>
           <w:sz w:val="18"/>
         </w:rPr>
-        <w:t xml:space="preserve">图 6 两日型日内负载形状</w:t>
+        <w:t>图 6 两日型日内负载形状</w:t>
       </w:r>
     </w:p>
     <w:p>
@@ -5613,7 +5612,7 @@
           <w:rFonts w:ascii="宋体" w:hAnsi="宋体" w:eastAsia="宋体"/>
           <w:sz w:val="21"/>
         </w:rPr>
-        <w:t xml:space="preserve">叠放两日型的 144 段平均功率曲线可见（图 6，左轴），低负载日整日功率约为高负载日的 0.632 倍；但右轴所示的逐段比值并不恒定，而是在 0.458 至 0.914 之间大幅起伏：凌晨与深夜比值高（两日型都处于基荷、差异小），白天工作时段比值低（高负载日的日间抬升远大于低负载日）。这说明两日型的差异集中在白天而非全天等比例出现，若强行用单一系数缩放会在日间产生系统偏差。因此本文对两个日型分别估计完整的日内形状，而不是共享一条曲线再乘系数——这也是后文负载预测器"同日型取近期同时段均值"设计的直接来源。至此，四问共用的数据前提已经明确：问题一用附件 1 的均值断面做单日优化，问题二至四在附件 2/4 的真实序列上、按日型分组滚动求解。</w:t>
+        <w:t>叠放两日型的 144 段平均功率曲线可见（图 6，左轴），低负载日整日功率约为高负载日的 0.632 倍；但右轴所示的逐段比值并不恒定，而是在 0.458 至 0.914 之间大幅起伏：凌晨与深夜比值高（两日型都处于基荷、差异小），白天工作时段比值低（高负载日的日间抬升远大于低负载日）。这说明两日型的差异集中在白天而非全天等比例出现，若强行用单一系数缩放会在日间产生系统偏差。因此本文对两个日型分别估计完整的日内形状，而不是共享一条曲线再乘系数——这也是后文负载预测器"同日型取近期同时段均值"设计的直接来源。至此，四问共用的数据前提已经明确：问题一用附件 1 的均值断面做单日优化，问题二至四在附件 2/4 的真实序列上、按日型分组滚动求解。</w:t>
       </w:r>
     </w:p>
     <w:p>
@@ -6311,20 +6310,20 @@
           <w:rFonts w:ascii="宋体" w:hAnsi="宋体" w:eastAsia="宋体"/>
           <w:sz w:val="21"/>
         </w:rPr>
-        <w:t>在给出数值前，先说明该问线性规划的几何结构。取任意相邻两段的购电量作平面截面，可直观看到可行域与最优点的关系；在当前参数与求解精度下目标值稳定，但不据此声称决策向量唯一。</w:t>
+        <w:t>在给出数值前，先说明该问线性规划的几何结构。图 7 以二维凸多边形说明可行域与最优点的关系，属于概念示意，并非由本算例数值计算得到的相邻两段精确投影；在当前参数与求解精度下目标值稳定，但不据此声称决策向量唯一。</w:t>
       </w:r>
     </w:p>
     <w:p>
       <w:pPr>
-        <w:keepNext/>
+        <w:keepNext w:val="1"/>
         <w:ind w:firstLine="0"/>
         <w:jc w:val="center"/>
       </w:pPr>
       <w:r>
         <w:drawing>
           <wp:inline xmlns:a="http://schemas.openxmlformats.org/drawingml/2006/main" xmlns:pic="http://schemas.openxmlformats.org/drawingml/2006/picture">
-            <wp:extent cx="5616000" cy="4287805"/>
-            <wp:docPr id="6" name="Picture 6"/>
+            <wp:extent cx="4248000" cy="3243340"/>
+            <wp:docPr id="6" name="Picture 6" descr="线性费用在凸可行域顶点取得最优"/>
             <wp:cNvGraphicFramePr>
               <a:graphicFrameLocks noChangeAspect="1"/>
             </wp:cNvGraphicFramePr>
@@ -6344,7 +6343,7 @@
                   <pic:spPr>
                     <a:xfrm>
                       <a:off x="0" y="0"/>
-                      <a:ext cx="5616000" cy="4287805"/>
+                      <a:ext cx="4248000" cy="3243340"/>
                     </a:xfrm>
                     <a:prstGeom prst="rect"/>
                   </pic:spPr>
@@ -6367,7 +6366,7 @@
           <w:rFonts w:ascii="宋体" w:hAnsi="宋体" w:eastAsia="宋体"/>
           <w:sz w:val="18"/>
         </w:rPr>
-        <w:t xml:space="preserve">图 7 相邻两段可行域示意</w:t>
+        <w:t>图 7 相邻两段可行域示意</w:t>
       </w:r>
     </w:p>
     <w:p>
@@ -6377,7 +6376,7 @@
           <w:rFonts w:ascii="宋体" w:hAnsi="宋体" w:eastAsia="宋体"/>
           <w:sz w:val="21"/>
         </w:rPr>
-        <w:t xml:space="preserve">图 7 中，供需平衡 (2) 给出购电量的下界（一条斜的下边界），单段功率上限给出左右两条竖界，储电量上下界经累积和折算成两条斜界，四类约束交出一个凸多边形可行域。目标函数 </w:t>
+        <w:t xml:space="preserve">图 7 用多边形边界概括线性约束共同限定决策范围的作用；具体可行域由式 (6) 的全部约束决定，图中边界仅作几何示意。目标函数 </w:t>
       </w:r>
       <m:oMath>
         <m:r>
@@ -6413,7 +6412,7 @@
           <w:rFonts w:ascii="宋体" w:hAnsi="宋体" w:eastAsia="宋体"/>
           <w:sz w:val="21"/>
         </w:rPr>
-        <w:t xml:space="preserve"> 是线性的，其等费用线是一族平行直线；当等费用线平移到与可行域相切时，切点必落在多边形的某个顶点上。这就是线性规划"最优解总在约束交点取得"的几何本质，也说明问题一不存在局部最优陷阱、解对初值不敏感。储电量轨迹本身则被上下界夹在一条水平走廊内（图 8），且因充电按 </w:t>
+        <w:t xml:space="preserve"> 是线性的，其等费用线是一族平行直线；当等费用线平移到与可行域相切时，存在某个顶点达到最优值，也可能有整条边上的点同为最优。这就是线性规划"存在顶点最优解"的几何本质，也说明问题一不存在局部最优陷阱、解对初值不敏感。储电量轨迹本身则被上下界夹在一条水平走廊内（图 8），且因充电按 </w:t>
       </w:r>
       <m:oMath>
         <m:sSub>
@@ -6489,15 +6488,15 @@
     </w:p>
     <w:p>
       <w:pPr>
-        <w:keepNext/>
+        <w:keepNext w:val="1"/>
         <w:ind w:firstLine="0"/>
         <w:jc w:val="center"/>
       </w:pPr>
       <w:r>
         <w:drawing>
           <wp:inline xmlns:a="http://schemas.openxmlformats.org/drawingml/2006/main" xmlns:pic="http://schemas.openxmlformats.org/drawingml/2006/picture">
-            <wp:extent cx="5616000" cy="3368459"/>
-            <wp:docPr id="7" name="Picture 7"/>
+            <wp:extent cx="4248000" cy="2547937"/>
+            <wp:docPr id="7" name="Picture 7" descr="可行储能轨迹受走廊、斜率和闭合三重约束"/>
             <wp:cNvGraphicFramePr>
               <a:graphicFrameLocks noChangeAspect="1"/>
             </wp:cNvGraphicFramePr>
@@ -6517,7 +6516,7 @@
                   <pic:spPr>
                     <a:xfrm>
                       <a:off x="0" y="0"/>
-                      <a:ext cx="5616000" cy="3368459"/>
+                      <a:ext cx="4248000" cy="2547937"/>
                     </a:xfrm>
                     <a:prstGeom prst="rect"/>
                   </pic:spPr>
@@ -6540,7 +6539,7 @@
           <w:rFonts w:ascii="宋体" w:hAnsi="宋体" w:eastAsia="宋体"/>
           <w:sz w:val="18"/>
         </w:rPr>
-        <w:t xml:space="preserve">图 8 储电量可行走廊示意</w:t>
+        <w:t>图 8 储电量可行走廊示意</w:t>
       </w:r>
     </w:p>
     <w:p>
@@ -6550,7 +6549,7 @@
           <w:rFonts w:ascii="宋体" w:hAnsi="宋体" w:eastAsia="宋体"/>
           <w:sz w:val="21"/>
         </w:rPr>
-        <w:t xml:space="preserve">从任一时刻出发，单段储电量的涨落幅度受充放功率上限限制形成一个可达锥（图 8）；由于放电要除以效率、充电要乘以效率，向下可达幅度略大于向上，这一不对称正是往返 19% 损耗在状态空间中的体现。问题一要求首尾等高，因此轨迹两端必须落在走廊的同一高度，全天的充放安排必须自洽闭合。</w:t>
+        <w:t>从任一时刻出发，单段储电量的涨落幅度受充放功率上限限制形成一个可达锥（图 8）；由于放电要除以效率、充电要乘以效率，向下可达幅度略大于向上，这一不对称正是往返 19% 损耗在状态空间中的体现。问题一要求首尾等高，因此轨迹两端必须落在走廊的同一高度，全天的充放安排必须自洽闭合。</w:t>
       </w:r>
     </w:p>
     <w:p>
@@ -6573,12 +6572,12 @@
           <w:rFonts w:ascii="宋体" w:hAnsi="宋体" w:eastAsia="宋体"/>
           <w:sz w:val="21"/>
         </w:rPr>
-        <w:t xml:space="preserve">求解得全天最优购电费 35126.95 元。图 9 展示逐段供需构成与电价的对应关系。</w:t>
+        <w:t>求解得全天最优购电费 35126.95 元。图 9 展示逐段供需构成与电价的对应关系。</w:t>
       </w:r>
     </w:p>
     <w:p>
       <w:pPr>
-        <w:keepNext/>
+        <w:keepNext w:val="1"/>
         <w:ind w:firstLine="0"/>
         <w:jc w:val="center"/>
       </w:pPr>
@@ -6586,7 +6585,7 @@
         <w:drawing>
           <wp:inline xmlns:a="http://schemas.openxmlformats.org/drawingml/2006/main" xmlns:pic="http://schemas.openxmlformats.org/drawingml/2006/picture">
             <wp:extent cx="5265000" cy="3685500"/>
-            <wp:docPr id="8" name="Picture 8"/>
+            <wp:docPr id="8" name="Picture 8" descr="储能把谷时购电转移到峰时使用"/>
             <wp:cNvGraphicFramePr>
               <a:graphicFrameLocks noChangeAspect="1"/>
             </wp:cNvGraphicFramePr>
@@ -6629,7 +6628,7 @@
           <w:rFonts w:ascii="宋体" w:hAnsi="宋体" w:eastAsia="宋体"/>
           <w:sz w:val="18"/>
         </w:rPr>
-        <w:t xml:space="preserve">图 9 问题一最优调度构成</w:t>
+        <w:t>图 9 问题一最优调度构成</w:t>
       </w:r>
     </w:p>
     <w:p>
@@ -6639,12 +6638,12 @@
           <w:rFonts w:ascii="宋体" w:hAnsi="宋体" w:eastAsia="宋体"/>
           <w:sz w:val="21"/>
         </w:rPr>
-        <w:t xml:space="preserve">堆叠显示每段的负载、光伏、购电与储能充放电，并在下方对应电价（图 9）。可以看到储能在凌晨与午间两个价格低谷集中充电（图中橙色负向区域），在早高峰 6:00 前后与晚高峰 17:00–20:00 集中放电顶替购电，使计划购电量整体从高价时段前移到低价时段。储能的这一"低充高放"把负载沿价格轴重新分配，全天购电费从无储能直接购电的基线 48052.05 元降到 35126.95 元，节省 12925.10 元、降幅 26.90%。图 10 从储电量相位进一步印证这一机理。</w:t>
+        <w:t>堆叠显示每段的负载、光伏、购电与储能充放电，并在下方对应电价（图 9）。可以看到储能在凌晨与午间两个价格低谷集中充电（图中橙色负向区域），在早高峰 6:00 前后与晚高峰 17:00–20:00 集中放电顶替购电，使计划购电量整体从高价时段前移到低价时段。储能的这一"低充高放"把负载沿价格轴重新分配，全天购电费从无储能直接购电的基线 48052.05 元降到 35126.95 元，节省 12925.10 元、降幅 26.90%。图 10 从储电量相位进一步印证这一机理。</w:t>
       </w:r>
     </w:p>
     <w:p>
       <w:pPr>
-        <w:keepNext/>
+        <w:keepNext w:val="1"/>
         <w:ind w:firstLine="0"/>
         <w:jc w:val="center"/>
       </w:pPr>
@@ -6652,7 +6651,7 @@
         <w:drawing>
           <wp:inline xmlns:a="http://schemas.openxmlformats.org/drawingml/2006/main" xmlns:pic="http://schemas.openxmlformats.org/drawingml/2006/picture">
             <wp:extent cx="5265000" cy="2983500"/>
-            <wp:docPr id="9" name="Picture 9"/>
+            <wp:docPr id="9" name="Picture 9" descr="电池在低价段充电并在高价段释放"/>
             <wp:cNvGraphicFramePr>
               <a:graphicFrameLocks noChangeAspect="1"/>
             </wp:cNvGraphicFramePr>
@@ -6695,7 +6694,7 @@
           <w:rFonts w:ascii="宋体" w:hAnsi="宋体" w:eastAsia="宋体"/>
           <w:sz w:val="18"/>
         </w:rPr>
-        <w:t xml:space="preserve">图 10 问题一储电量与电价相位</w:t>
+        <w:t>图 10 问题一储电量与电价相位</w:t>
       </w:r>
     </w:p>
     <w:p>
@@ -6754,12 +6753,12 @@
           <w:rFonts w:ascii="宋体" w:hAnsi="宋体" w:eastAsia="宋体"/>
           <w:sz w:val="21"/>
         </w:rPr>
-        <w:t xml:space="preserve">节省的 12925.10 元并非全部可得，其中一部分被储能往返损耗吞掉。图 11 用瀑布图分解这一结构。</w:t>
+        <w:t>节省的 12925.10 元并非全部可得，其中一部分被储能往返损耗吞掉。图 11 用瀑布图分解这一结构。</w:t>
       </w:r>
     </w:p>
     <w:p>
       <w:pPr>
-        <w:keepNext/>
+        <w:keepNext w:val="1"/>
         <w:ind w:firstLine="0"/>
         <w:jc w:val="center"/>
       </w:pPr>
@@ -6767,7 +6766,7 @@
         <w:drawing>
           <wp:inline xmlns:a="http://schemas.openxmlformats.org/drawingml/2006/main" xmlns:pic="http://schemas.openxmlformats.org/drawingml/2006/picture">
             <wp:extent cx="5265000" cy="2895750"/>
-            <wp:docPr id="10" name="Picture 10"/>
+            <wp:docPr id="10" name="Picture 10" descr="节省主要来自峰谷套利并扣除效率损耗"/>
             <wp:cNvGraphicFramePr>
               <a:graphicFrameLocks noChangeAspect="1"/>
             </wp:cNvGraphicFramePr>
@@ -6810,7 +6809,7 @@
           <w:rFonts w:ascii="宋体" w:hAnsi="宋体" w:eastAsia="宋体"/>
           <w:sz w:val="18"/>
         </w:rPr>
-        <w:t xml:space="preserve">图 11 问题一费用瀑布分解</w:t>
+        <w:t>图 11 问题一费用瀑布分解</w:t>
       </w:r>
     </w:p>
     <w:p>
@@ -6820,7 +6819,7 @@
           <w:rFonts w:ascii="宋体" w:hAnsi="宋体" w:eastAsia="宋体"/>
           <w:sz w:val="21"/>
         </w:rPr>
-        <w:t xml:space="preserve">从无储能基线 48052.05 元出发（图 11），储能套利本可节省更多，但单向效率 0.9（往返 0.81）造成 2749.86 元不可回收损耗，故最优费用停在 35126.95 元；若储能无损（</w:t>
+        <w:t>从无储能基线 48052.05 元出发（图 11），储能套利本可节省更多，但单向效率 0.9（往返 0.81）造成 2749.86 元不可回收损耗，故最优费用停在 35126.95 元；若储能无损（</w:t>
       </w:r>
       <m:oMath>
         <m:r>
@@ -6842,12 +6841,12 @@
           <w:rFonts w:ascii="宋体" w:hAnsi="宋体" w:eastAsia="宋体"/>
           <w:sz w:val="21"/>
         </w:rPr>
-        <w:t xml:space="preserve">题面"充放电效率为 90%"未明确是单向还是往返，属关键歧义，故对五种读法做灵敏度分析（图 12）。</w:t>
+        <w:t>题面"充放电效率为 90%"未明确是单向还是往返，属关键歧义，故对五种读法做灵敏度分析（图 12）。</w:t>
       </w:r>
     </w:p>
     <w:p>
       <w:pPr>
-        <w:keepNext/>
+        <w:keepNext w:val="1"/>
         <w:ind w:firstLine="0"/>
         <w:jc w:val="center"/>
       </w:pPr>
@@ -6855,7 +6854,7 @@
         <w:drawing>
           <wp:inline xmlns:a="http://schemas.openxmlformats.org/drawingml/2006/main" xmlns:pic="http://schemas.openxmlformats.org/drawingml/2006/picture">
             <wp:extent cx="5265000" cy="2632500"/>
-            <wp:docPr id="11" name="Picture 11"/>
+            <wp:docPr id="11" name="Picture 11" descr="结论对合理效率扰动保持稳定"/>
             <wp:cNvGraphicFramePr>
               <a:graphicFrameLocks noChangeAspect="1"/>
             </wp:cNvGraphicFramePr>
@@ -6898,7 +6897,7 @@
           <w:rFonts w:ascii="宋体" w:hAnsi="宋体" w:eastAsia="宋体"/>
           <w:sz w:val="18"/>
         </w:rPr>
-        <w:t xml:space="preserve">图 12 效率读法灵敏度</w:t>
+        <w:t>图 12 效率读法灵敏度</w:t>
       </w:r>
     </w:p>
     <w:p>
@@ -7244,12 +7243,12 @@
           <w:rFonts w:ascii="宋体" w:hAnsi="宋体" w:eastAsia="宋体"/>
           <w:sz w:val="21"/>
         </w:rPr>
-        <w:t xml:space="preserve">，本文直接采用题目提供的官方整点预报，回避了预报建模本身的误差引入。图 13 比较了五种负载预测设定在 334 天留出期上的平均绝对误差。</w:t>
+        <w:t>，本文直接采用题目提供的官方整点预报，回避了预报建模本身的误差引入。图 13 比较了五种负载预测设定在 334 天留出期上的平均绝对误差。</w:t>
       </w:r>
     </w:p>
     <w:p>
       <w:pPr>
-        <w:keepNext/>
+        <w:keepNext w:val="1"/>
         <w:ind w:firstLine="0"/>
         <w:jc w:val="center"/>
       </w:pPr>
@@ -7257,7 +7256,7 @@
         <w:drawing>
           <wp:inline xmlns:a="http://schemas.openxmlformats.org/drawingml/2006/main" xmlns:pic="http://schemas.openxmlformats.org/drawingml/2006/picture">
             <wp:extent cx="5265000" cy="2808000"/>
-            <wp:docPr id="12" name="Picture 12"/>
+            <wp:docPr id="12" name="Picture 12" descr="日型分组预测器在两类日型上更稳健"/>
             <wp:cNvGraphicFramePr>
               <a:graphicFrameLocks noChangeAspect="1"/>
             </wp:cNvGraphicFramePr>
@@ -7300,7 +7299,7 @@
           <w:rFonts w:ascii="宋体" w:hAnsi="宋体" w:eastAsia="宋体"/>
           <w:sz w:val="18"/>
         </w:rPr>
-        <w:t xml:space="preserve">图 13 负载预测器误差对比</w:t>
+        <w:t>图 13 负载预测器误差对比</w:t>
       </w:r>
     </w:p>
     <w:p>
@@ -8893,7 +8892,7 @@
           <w:rFonts w:ascii="宋体" w:hAnsi="宋体" w:eastAsia="宋体"/>
           <w:sz w:val="21"/>
         </w:rPr>
-        <w:t xml:space="preserve">为单独考察 §6.3 报童逻辑中的备用作用，另设点预测标量裕度基线，与 §6.4 的场景规划主方案区分。引入标量裕度 </w:t>
+        <w:t xml:space="preserve">为单独考察备用的作用，另设点预测标量裕度基线，与场景近似日前计划器区分。引入标量裕度 </w:t>
       </w:r>
       <m:oMath>
         <m:r>
@@ -8975,15 +8974,15 @@
     </w:p>
     <w:p>
       <w:pPr>
-        <w:keepNext/>
+        <w:keepNext w:val="1"/>
         <w:ind w:firstLine="0"/>
         <w:jc w:val="center"/>
       </w:pPr>
       <w:r>
         <w:drawing>
           <wp:inline xmlns:a="http://schemas.openxmlformats.org/drawingml/2006/main" xmlns:pic="http://schemas.openxmlformats.org/drawingml/2006/picture">
-            <wp:extent cx="5265000" cy="2983500"/>
-            <wp:docPr id="13" name="Picture 13"/>
+            <wp:extent cx="5400000" cy="2924167"/>
+            <wp:docPr id="13" name="Picture 13" descr="当前候选网格的最优裕度为0.03；扫描与最终Q2执行口径应区分"/>
             <wp:cNvGraphicFramePr>
               <a:graphicFrameLocks noChangeAspect="1"/>
             </wp:cNvGraphicFramePr>
@@ -9003,7 +9002,7 @@
                   <pic:spPr>
                     <a:xfrm>
                       <a:off x="0" y="0"/>
-                      <a:ext cx="5265000" cy="2983500"/>
+                      <a:ext cx="5400000" cy="2924167"/>
                     </a:xfrm>
                     <a:prstGeom prst="rect"/>
                   </pic:spPr>
@@ -9026,7 +9025,7 @@
           <w:rFonts w:ascii="宋体" w:hAnsi="宋体" w:eastAsia="宋体"/>
           <w:sz w:val="18"/>
         </w:rPr>
-        <w:t xml:space="preserve">图 14 点预测基线的裕度费用与风险权衡</w:t>
+        <w:t>图 14 点预测基线的裕度与风险权衡</w:t>
       </w:r>
     </w:p>
     <w:p>
@@ -9118,7 +9117,7 @@
           <w:rFonts w:ascii="Times New Roman" w:eastAsia="宋体"/>
           <w:sz w:val="22"/>
         </w:rPr>
-        <w:t>该点预测扫描在 m=0.03 时得到 14158935.77 元，与问题三内部 S0 的构造和结算一致；问题二场景规划主方案的费用为 14104438.86 元。两者采用不同日前计划器，因此图 14 的最低点不能替代问题二主方案费用。</w:t>
+        <w:t>该点预测基线在裕度为 3% 时得到 14158935.77 元，与问题三内部 S0 一致；问题二场景近似主方案的费用为 14104438.86 元。图 14 的最低点不能替代问题二主方案费用。</w:t>
       </w:r>
     </w:p>
     <w:p>
@@ -10174,20 +10173,20 @@
           <w:rFonts w:ascii="宋体" w:hAnsi="宋体" w:eastAsia="宋体"/>
           <w:sz w:val="21"/>
         </w:rPr>
-        <w:t xml:space="preserve">关键的因果边界如图 15 所示。</w:t>
+        <w:t>关键的因果边界如图 15 所示。</w:t>
       </w:r>
     </w:p>
     <w:p>
       <w:pPr>
-        <w:keepNext/>
+        <w:keepNext w:val="1"/>
         <w:ind w:firstLine="0"/>
         <w:jc w:val="center"/>
       </w:pPr>
       <w:r>
         <w:drawing>
           <wp:inline xmlns:a="http://schemas.openxmlformats.org/drawingml/2006/main" xmlns:pic="http://schemas.openxmlformats.org/drawingml/2006/picture">
-            <wp:extent cx="5616000" cy="2746809"/>
-            <wp:docPr id="14" name="Picture 14"/>
+            <wp:extent cx="5040000" cy="2465085"/>
+            <wp:docPr id="14" name="Picture 14" descr="滚动决策严格服从随时间推进的因果信息边界"/>
             <wp:cNvGraphicFramePr>
               <a:graphicFrameLocks noChangeAspect="1"/>
             </wp:cNvGraphicFramePr>
@@ -10207,7 +10206,7 @@
                   <pic:spPr>
                     <a:xfrm>
                       <a:off x="0" y="0"/>
-                      <a:ext cx="5616000" cy="2746809"/>
+                      <a:ext cx="5040000" cy="2465085"/>
                     </a:xfrm>
                     <a:prstGeom prst="rect"/>
                   </pic:spPr>
@@ -10230,7 +10229,7 @@
           <w:rFonts w:ascii="宋体" w:hAnsi="宋体" w:eastAsia="宋体"/>
           <w:sz w:val="18"/>
         </w:rPr>
-        <w:t xml:space="preserve">图 15 滚动决策信息集示意</w:t>
+        <w:t>图 15 滚动决策信息集示意</w:t>
       </w:r>
     </w:p>
     <w:p>
@@ -10240,12 +10239,12 @@
           <w:rFonts w:ascii="宋体" w:hAnsi="宋体" w:eastAsia="宋体"/>
           <w:sz w:val="21"/>
         </w:rPr>
-        <w:t xml:space="preserve">如图 15，每一行对应一个决策时刻：实线段是该时刻已获得的实测区间，虚线段是仍可调整的未来时段，二者被因果边界隔开。边界随决策时刻逐行右移，说明越晚的一次重解掌握的实测越多、但可调整的余量越少。这一结构决定了滚动调整只能修正边界之后的时段、不能回改已发生的偏差，也决定了后续预报的价值必须足够大才能抵消调整费用。而后续预报确实更准：图 16 展示同一目标小时下不同发布时刻的预报精度。</w:t>
+        <w:t>如图 15，每一行对应一个决策时刻：实线段是该时刻已获得的实测区间，虚线段是仍可调整的未来时段，二者被因果边界隔开。边界随决策时刻逐行右移，说明越晚的一次重解掌握的实测越多、但可调整的余量越少。这一结构决定了滚动调整只能修正边界之后的时段、不能回改已发生的偏差，也决定了后续预报的价值必须足够大才能抵消调整费用。而后续预报确实更准：图 16 展示同一目标小时下不同发布时刻的预报精度。</w:t>
       </w:r>
     </w:p>
     <w:p>
       <w:pPr>
-        <w:keepNext/>
+        <w:keepNext w:val="1"/>
         <w:ind w:firstLine="0"/>
         <w:jc w:val="center"/>
       </w:pPr>
@@ -10253,7 +10252,7 @@
         <w:drawing>
           <wp:inline xmlns:a="http://schemas.openxmlformats.org/drawingml/2006/main" xmlns:pic="http://schemas.openxmlformats.org/drawingml/2006/picture">
             <wp:extent cx="5265000" cy="2720250"/>
-            <wp:docPr id="15" name="Picture 15"/>
+            <wp:docPr id="15" name="Picture 15" descr="较晚发布的预报对同一目标小时更准确"/>
             <wp:cNvGraphicFramePr>
               <a:graphicFrameLocks noChangeAspect="1"/>
             </wp:cNvGraphicFramePr>
@@ -10296,7 +10295,7 @@
           <w:rFonts w:ascii="宋体" w:hAnsi="宋体" w:eastAsia="宋体"/>
           <w:sz w:val="18"/>
         </w:rPr>
-        <w:t xml:space="preserve">图 16 同目标不同发布时刻预报</w:t>
+        <w:t>图 16 同目标不同发布时刻预报</w:t>
       </w:r>
     </w:p>
     <w:p>
@@ -10306,7 +10305,7 @@
           <w:rFonts w:ascii="宋体" w:hAnsi="宋体" w:eastAsia="宋体"/>
           <w:sz w:val="21"/>
         </w:rPr>
-        <w:t xml:space="preserve">用哑铃图对午后 13:00–17:00 五个目标小时比较 0:00 发布与 12:00 发布的光伏预报 MAE（图 16），可见明显的精度跃升。以 13:00 为例，MAE 由 0:00 发布的 624.56 kW 降到 12:00 发布的 62.62 kW，降幅 90.0%；五个目标小时的降幅分别为 90.0%、84.4%、79.6%、73.3%、67.8%。同目标口径排除了"不同小时本身难度不同"的混淆，纯粹反映提前期缩短带来的精度提升。这正是引入 6:00/12:00/18:00 后续决策的客观依据——临近时段的预报显著变准，据此调整计划能有效压缩缺口。</w:t>
+        <w:t>用哑铃图对午后 13:00–17:00 五个目标小时比较 0:00 发布与 12:00 发布的光伏预报 MAE（图 16），可见明显的精度跃升。以 13:00 为例，MAE 由 0:00 发布的 624.56 kW 降到 12:00 发布的 62.62 kW，降幅 90.0%；五个目标小时的降幅分别为 90.0%、84.4%、79.6%、73.3%、67.8%。同目标口径排除了"不同小时本身难度不同"的混淆，纯粹反映提前期缩短带来的精度提升。这正是引入 6:00/12:00/18:00 后续决策的客观依据——临近时段的预报显著变准，据此调整计划能有效压缩缺口。</w:t>
       </w:r>
     </w:p>
     <w:p>
@@ -10883,13 +10882,26 @@
       </w:r>
     </w:p>
     <w:p>
+      <w:pPr>
+        <w:pStyle w:val="Heading2"/>
+        <w:ind w:firstLine="0"/>
+      </w:pPr>
+      <w:r>
+        <w:rPr>
+          <w:rFonts w:ascii="黑体" w:hAnsi="黑体" w:eastAsia="黑体"/>
+          <w:sz w:val="26"/>
+        </w:rPr>
+        <w:t>7.4 滚动执行结果</w:t>
+      </w:r>
+    </w:p>
+    <w:p>
       <w:pPr/>
       <w:r>
         <w:rPr>
-          <w:rFonts w:ascii="Times New Roman" w:eastAsia="宋体"/>
-          <w:sz w:val="22"/>
-        </w:rPr>
-        <w:t>图 17 在原计划 b&gt;0、电价 p&gt;0 时令 r=a/b，对照两种费用核。下调区间的差异来自基价是否随实际调整量减少；上调区间两口径重合。图中未计紧急购电项，亦未包含重新优化决策后的策略差异。</w:t>
+          <w:rFonts w:ascii="宋体" w:hAnsi="宋体" w:eastAsia="宋体"/>
+          <w:sz w:val="21"/>
+        </w:rPr>
+        <w:t>在 334 天交付期上滚动求解，主计法 R-b 下滚动方案 S1 总费用为 13537151.33 元，构成为：计划基价 12517803.35 元、上调费用 501902.32 元、下调违约费用 280033.55 元、紧急购电费 237412.11 元；紧急购电量为 52835.77 kWh，储能循环量为 5242231.26 kWh，弃光量为 1732440.85 kWh。初始 SOC 仅在 1 月 1 日设置，2 月 1 日 SOC 为 2269.77 kWh，年末回到 6000 kWh。图 17 以某典型日展示滚动执行过程。</w:t>
       </w:r>
     </w:p>
     <w:p>
@@ -10901,88 +10913,8 @@
       <w:r>
         <w:drawing>
           <wp:inline xmlns:a="http://schemas.openxmlformats.org/drawingml/2006/main" xmlns:pic="http://schemas.openxmlformats.org/drawingml/2006/picture">
-            <wp:extent cx="5400000" cy="2306820"/>
-            <wp:docPr id="26" name="fig_settlement_rule" descr="两种结算口径的归一化分段费用"/>
-            <wp:cNvGraphicFramePr>
-              <a:graphicFrameLocks noChangeAspect="1"/>
-            </wp:cNvGraphicFramePr>
-            <a:graphic>
-              <a:graphicData uri="http://schemas.openxmlformats.org/drawingml/2006/picture">
-                <pic:pic>
-                  <pic:nvPicPr>
-                    <pic:cNvPr id="0" name="fig_roadmap.png"/>
-                    <pic:cNvPicPr/>
-                  </pic:nvPicPr>
-                  <pic:blipFill>
-                    <a:blip r:embed="rIdV3Figure17"/>
-                    <a:stretch>
-                      <a:fillRect/>
-                    </a:stretch>
-                  </pic:blipFill>
-                  <pic:spPr>
-                    <a:xfrm>
-                      <a:off x="0" y="0"/>
-                      <a:ext cx="5400000" cy="2306820"/>
-                    </a:xfrm>
-                    <a:prstGeom prst="rect"/>
-                  </pic:spPr>
-                </pic:pic>
-              </a:graphicData>
-            </a:graphic>
-          </wp:inline>
-        </w:drawing>
-      </w:r>
-    </w:p>
-    <w:p>
-      <w:pPr>
-        <w:pStyle w:val="Caption"/>
-        <w:spacing w:after="100"/>
-        <w:ind w:firstLine="0"/>
-        <w:jc w:val="center"/>
-        <w:keepNext w:val="0"/>
-      </w:pPr>
-      <w:r>
-        <w:rPr>
-          <w:rFonts w:ascii="Times New Roman" w:eastAsia="宋体"/>
-          <w:sz w:val="20"/>
-        </w:rPr>
-        <w:t>图 17 两种结算口径的归一化分段费用</w:t>
-      </w:r>
-    </w:p>
-    <w:p>
-      <w:pPr>
-        <w:pStyle w:val="Heading2"/>
-        <w:ind w:firstLine="0"/>
-      </w:pPr>
-      <w:r>
-        <w:rPr>
-          <w:rFonts w:ascii="黑体" w:hAnsi="黑体" w:eastAsia="黑体"/>
-          <w:sz w:val="26"/>
-        </w:rPr>
-        <w:t>7.4 滚动执行结果</w:t>
-      </w:r>
-    </w:p>
-    <w:p>
-      <w:pPr/>
-      <w:r>
-        <w:rPr>
-          <w:rFonts w:ascii="宋体" w:hAnsi="宋体" w:eastAsia="宋体"/>
-          <w:sz w:val="21"/>
-        </w:rPr>
-        <w:t xml:space="preserve">在 334 天交付期上滚动求解，主计法 R-b 下滚动方案 S1 总费用为 13537151.33 元，构成为：计划基价 12517803.35 元、上调费用 501902.32 元、下调违约费用 280033.55 元、紧急购电费 237412.11 元；紧急购电量为 52835.77 kWh，储能循环量为 5242231.26 kWh，弃光量为 1732440.85 kWh。初始 SOC 仅在 1 月 1 日设置，2 月 1 日 SOC 为 2269.77 kWh，年末回到 6000 kWh。图 18 以某典型日展示滚动执行过程。</w:t>
-      </w:r>
-    </w:p>
-    <w:p>
-      <w:pPr>
-        <w:keepNext/>
-        <w:ind w:firstLine="0"/>
-        <w:jc w:val="center"/>
-      </w:pPr>
-      <w:r>
-        <w:drawing>
-          <wp:inline xmlns:a="http://schemas.openxmlformats.org/drawingml/2006/main" xmlns:pic="http://schemas.openxmlformats.org/drawingml/2006/picture">
-            <wp:extent cx="5601064" cy="4018828"/>
-            <wp:docPr id="16" name="Picture 16"/>
+            <wp:extent cx="5400000" cy="2924167"/>
+            <wp:docPr id="16" name="Picture 16" descr="滚动窗口逐次缩短且已执行决策不可回写"/>
             <wp:cNvGraphicFramePr>
               <a:graphicFrameLocks noChangeAspect="1"/>
             </wp:cNvGraphicFramePr>
@@ -11002,7 +10934,7 @@
                   <pic:spPr>
                     <a:xfrm>
                       <a:off x="0" y="0"/>
-                      <a:ext cx="5601064" cy="4018828"/>
+                      <a:ext cx="5400000" cy="2924167"/>
                     </a:xfrm>
                     <a:prstGeom prst="rect"/>
                   </pic:spPr>
@@ -11025,7 +10957,7 @@
           <w:rFonts w:ascii="宋体" w:hAnsi="宋体" w:eastAsia="宋体"/>
           <w:sz w:val="18"/>
         </w:rPr>
-        <w:t xml:space="preserve">图 18 滚动决策结构与执行</w:t>
+        <w:t>图 17 日前计划与滚动执行对照</w:t>
       </w:r>
     </w:p>
     <w:p>
@@ -11035,7 +10967,7 @@
           <w:rFonts w:ascii="宋体" w:hAnsi="宋体" w:eastAsia="宋体"/>
           <w:sz w:val="21"/>
         </w:rPr>
-        <w:t xml:space="preserve">图中 (a) 画出四个决策时刻各自可重优化的时段范围（随 </w:t>
+        <w:t xml:space="preserve">图中决策时刻的边界随 </w:t>
       </w:r>
       <m:oMath>
         <m:r>
@@ -11047,7 +10979,7 @@
           <w:rFonts w:ascii="宋体" w:hAnsi="宋体" w:eastAsia="宋体"/>
           <w:sz w:val="21"/>
         </w:rPr>
-        <w:t xml:space="preserve"> 右移），(b) 对照 0:00 原计划 </w:t>
+        <w:t xml:space="preserve"> 右移；上面板对照 0:00 原计划 </w:t>
       </w:r>
       <m:oMath>
         <m:sSub>
@@ -11089,7 +11021,7 @@
           <w:rFonts w:ascii="宋体" w:hAnsi="宋体" w:eastAsia="宋体"/>
           <w:sz w:val="21"/>
         </w:rPr>
-        <w:t xml:space="preserve"> ，(c) 单列两者的有符号差：午后随着光伏预报变准，计划被向下修正（对应 </w:t>
+        <w:t xml:space="preserve"> ，下面板给出二者的有符号差：午后随着光伏预报变准，计划被向下修正（对应 </w:t>
       </w:r>
       <m:oMath>
         <m:sSup>
@@ -11131,20 +11063,20 @@
           <w:rFonts w:ascii="宋体" w:hAnsi="宋体" w:eastAsia="宋体"/>
           <w:sz w:val="21"/>
         </w:rPr>
-        <w:t xml:space="preserve">），虚线标出三个后续决策时刻。该示例显示了日内调整的发生时段，单日曲线本身不构成总体收益或因果效果的证据。滚动带来的收益需扣除调整费用后净核算，图 19 给出完整分解。</w:t>
+        <w:t>），虚线标出三个后续决策时刻。该单日示例显示调整的时段和幅度，不构成总体收益或因果效应的证明。滚动带来的收益需扣除调整费用后净核算，图 18 将各费用分项的差额归结为净节省。</w:t>
       </w:r>
     </w:p>
     <w:p>
       <w:pPr>
-        <w:keepNext/>
+        <w:keepNext w:val="1"/>
         <w:ind w:firstLine="0"/>
         <w:jc w:val="center"/>
       </w:pPr>
       <w:r>
         <w:drawing>
           <wp:inline xmlns:a="http://schemas.openxmlformats.org/drawingml/2006/main" xmlns:pic="http://schemas.openxmlformats.org/drawingml/2006/picture">
-            <wp:extent cx="5265000" cy="2983500"/>
-            <wp:docPr id="17" name="Picture 17"/>
+            <wp:extent cx="5400000" cy="2650026"/>
+            <wp:docPr id="17" name="Picture 17" descr="滚动修正以较小调整成本换取更低缺口风险"/>
             <wp:cNvGraphicFramePr>
               <a:graphicFrameLocks noChangeAspect="1"/>
             </wp:cNvGraphicFramePr>
@@ -11164,7 +11096,7 @@
                   <pic:spPr>
                     <a:xfrm>
                       <a:off x="0" y="0"/>
-                      <a:ext cx="5265000" cy="2983500"/>
+                      <a:ext cx="5400000" cy="2650026"/>
                     </a:xfrm>
                     <a:prstGeom prst="rect"/>
                   </pic:spPr>
@@ -11187,7 +11119,7 @@
           <w:rFonts w:ascii="宋体" w:hAnsi="宋体" w:eastAsia="宋体"/>
           <w:sz w:val="18"/>
         </w:rPr>
-        <w:t xml:space="preserve">图 19 问题三费用构成分解</w:t>
+        <w:t>图 18 滚动调整的净收益来源</w:t>
       </w:r>
     </w:p>
     <w:p>
@@ -11197,7 +11129,7 @@
           <w:rFonts w:ascii="宋体" w:hAnsi="宋体" w:eastAsia="宋体"/>
           <w:sz w:val="21"/>
         </w:rPr>
-        <w:t xml:space="preserve">完整分解对比了两种内部策略（图 19）：Q3 内部基线 S0 仅在 0:00 锁定计划，总费用 14158935.77 元（计划 13112907.26 元、紧急购电费 1046028.51 元）；S1 允许滚动调整，总费用 13537151.33 元。S1 产生 781935.87 元调整费用（上调 501902.32 元、下调违约 280033.55 元），同时把紧急购电费压到 237412.11 元，相对 Q3 内部 S0 节省 621784.44 元，即 62.18 万元。若以问题二“场景近似日前计划器 + 因果实时执行策略”的 14104438.86 元为跨问题基线，则节省 567287.52 元，即 56.73 万元。两种基线口径不可混用；前者隔离是否允许日内调整，后者回答相对问题二最终方案的费用变化。</w:t>
+        <w:t>差额分解对比了两种内部策略（图 18）：Q3 内部基线 S0 仅在 0:00 锁定计划，总费用 14158935.77 元（计划 13112907.26 元、紧急购电费 1046028.51 元）；S1 允许滚动调整，总费用 13537151.33 元。S1 产生 781935.87 元调整费用（上调 501902.32 元、下调违约 280033.55 元），同时把紧急购电费压到 237412.11 元，相对 Q3 内部 S0 节省 621784.44 元，即 62.18 万元。若以问题二“场景近似日前计划器 + 因果实时执行策略”的 14104438.86 元为跨问题基线，则节省 567287.52 元，即 56.73 万元。两种基线口径不可混用；前者隔离是否允许日内调整，后者回答相对问题二最终方案的费用变化。</w:t>
       </w:r>
     </w:p>
     <w:p>
@@ -11207,12 +11139,12 @@
           <w:rFonts w:ascii="宋体" w:hAnsi="宋体" w:eastAsia="宋体"/>
           <w:sz w:val="21"/>
         </w:rPr>
-        <w:t xml:space="preserve">逐日配对费用差的 7 日循环块自助结果表明：相对 Q3 内部 S0 的交付期节省 95% 置信区间为 42.49 万—87.78 万元，相对 Q2 的区间为 37.39 万—79.11 万元，两者下限均高于 0，支持“交付期总体费用改善较稳定”的判断；但逐日胜率分别为 72.8% 和 59.6%，不能据此声称每天都更优。紧急购电量的压制效果可由日历热图直观对比（图 20）。</w:t>
+        <w:t>逐日配对费用差的 7 日循环块自助结果表明：相对 Q3 内部 S0 的交付期节省 95% 置信区间为 42.49 万—87.78 万元，相对 Q2 的区间为 37.39 万—79.11 万元，两者下限均高于 0，支持“交付期总体费用改善较稳定”的判断；但逐日胜率分别为 72.8% 和 59.6%，不能据此声称每天都更优。紧急购电量的压制效果可由日历热图直观对比（图 19）。</w:t>
       </w:r>
     </w:p>
     <w:p>
       <w:pPr>
-        <w:keepNext/>
+        <w:keepNext w:val="1"/>
         <w:ind w:firstLine="0"/>
         <w:jc w:val="center"/>
       </w:pPr>
@@ -11220,7 +11152,7 @@
         <w:drawing>
           <wp:inline xmlns:a="http://schemas.openxmlformats.org/drawingml/2006/main" xmlns:pic="http://schemas.openxmlformats.org/drawingml/2006/picture">
             <wp:extent cx="5265000" cy="3159000"/>
-            <wp:docPr id="18" name="Picture 18"/>
+            <wp:docPr id="18" name="Picture 18" descr="紧急购电是局部事件而非全年持续现象"/>
             <wp:cNvGraphicFramePr>
               <a:graphicFrameLocks noChangeAspect="1"/>
             </wp:cNvGraphicFramePr>
@@ -11263,7 +11195,7 @@
           <w:rFonts w:ascii="宋体" w:hAnsi="宋体" w:eastAsia="宋体"/>
           <w:sz w:val="18"/>
         </w:rPr>
-        <w:t xml:space="preserve">图 20 两方案紧急购电日历对比</w:t>
+        <w:t>图 19 两方案紧急购电日历对比</w:t>
       </w:r>
     </w:p>
     <w:p>
@@ -11273,7 +11205,7 @@
           <w:rFonts w:ascii="宋体" w:hAnsi="宋体" w:eastAsia="宋体"/>
           <w:sz w:val="21"/>
         </w:rPr>
-        <w:t xml:space="preserve">上下两行同色标铺开交付期逐日紧急购电量（图 20）：上行为问题二方案（187722.62 kWh），下行为问题三滚动方案（52835.77 kWh），降幅约 71.9%。滚动方案的热点格子更稀疏、颜色更浅，说明缺口削减主要集中在预报更新后可纠正的时段；仍有少数日出现较大紧急购电，不能据此推断所有极端日均已得到充分覆盖。</w:t>
+        <w:t>上下两行同色标铺开交付期逐日紧急购电量（图 19）：上行为问题二方案（187722.62 kWh），下行为问题三滚动方案（52835.77 kWh），降幅约 71.9%。滚动方案的热点格子更稀疏、颜色更浅，说明缺口削减主要集中在预报更新后可纠正的时段；仍有少数日出现较大紧急购电，不能据此推断所有极端日均已得到充分覆盖。</w:t>
       </w:r>
     </w:p>
     <w:p>
@@ -11296,20 +11228,20 @@
           <w:rFonts w:ascii="宋体" w:hAnsi="宋体" w:eastAsia="宋体"/>
           <w:sz w:val="21"/>
         </w:rPr>
-        <w:t xml:space="preserve">光伏后续预报以整点给出，需插值到 10 分钟粒度供优化使用。图 21 核查插值的一致性。</w:t>
+        <w:t>光伏后续预报以整点给出，需插值到 10 分钟粒度供优化使用。图 20 核查插值的一致性。</w:t>
       </w:r>
     </w:p>
     <w:p>
       <w:pPr>
-        <w:keepNext/>
+        <w:keepNext w:val="1"/>
         <w:ind w:firstLine="0"/>
         <w:jc w:val="center"/>
       </w:pPr>
       <w:r>
         <w:drawing>
           <wp:inline xmlns:a="http://schemas.openxmlformats.org/drawingml/2006/main" xmlns:pic="http://schemas.openxmlformats.org/drawingml/2006/picture">
-            <wp:extent cx="3988636" cy="3510000"/>
-            <wp:docPr id="19" name="Picture 19"/>
+            <wp:extent cx="5265000" cy="4633200"/>
+            <wp:docPr id="19" name="Picture 19" descr="插值结果保持日内形状并满足边界约束"/>
             <wp:cNvGraphicFramePr>
               <a:graphicFrameLocks noChangeAspect="1"/>
             </wp:cNvGraphicFramePr>
@@ -11329,7 +11261,7 @@
                   <pic:spPr>
                     <a:xfrm>
                       <a:off x="0" y="0"/>
-                      <a:ext cx="3988636" cy="3510000"/>
+                      <a:ext cx="5265000" cy="4633200"/>
                     </a:xfrm>
                     <a:prstGeom prst="rect"/>
                   </pic:spPr>
@@ -11352,7 +11284,7 @@
           <w:rFonts w:ascii="宋体" w:hAnsi="宋体" w:eastAsia="宋体"/>
           <w:sz w:val="18"/>
         </w:rPr>
-        <w:t xml:space="preserve">图 21 预报插值一致性核查</w:t>
+        <w:t>图 20 预报插值一致性核查</w:t>
       </w:r>
     </w:p>
     <w:p>
@@ -11362,7 +11294,7 @@
           <w:rFonts w:ascii="宋体" w:hAnsi="宋体" w:eastAsia="宋体"/>
           <w:sz w:val="21"/>
         </w:rPr>
-        <w:t xml:space="preserve">图 21 对某典型日的四个发布时刻，画出线性插值折线、附件 3 原始整点预报方块与附件 2 实际功率。插值曲线通过各整点预报点；夜间值仅由发布时刻可获得的预报本身决定，未借用当天未来真实光伏构造掩码。关于费用计法，对照计法 R-a 下 S1 总费用为 13790053.50 元，比主计法 R-b 高约 1.87%。R-a 以原始计划为基价，R-b 以最终执行量与原计划的分段关系计费；题面对此存在解释空间，二者差异不能被当作纯算法效果。本文以 R-b 为主计法并并列报告 R-a，供不同解释核对。</w:t>
+        <w:t>图 20 对某典型日的四个发布时刻，画出线性插值折线、附件 3 原始整点预报方块与附件 2 实际功率。插值曲线通过各整点预报点；夜间值仅由发布时刻可获得的预报本身决定，未借用当天未来真实光伏构造掩码。关于费用计法，对照计法 R-a 下 S1 总费用为 13790053.50 元，比主计法 R-b 高约 1.87%。R-a 以原始计划为基价，R-b 以最终执行量与原计划的分段关系计费；题面对此存在解释空间，二者差异不能被当作纯算法效果。本文以 R-b 为主计法并并列报告 R-a，供不同解释核对。</w:t>
       </w:r>
     </w:p>
     <w:p>
@@ -11461,20 +11393,20 @@
           <w:rFonts w:ascii="宋体" w:hAnsi="宋体" w:eastAsia="宋体"/>
           <w:sz w:val="21"/>
         </w:rPr>
-        <w:t xml:space="preserve">，并需评估"电价信息何时可知"对费用的影响。图 22 先刻画波动电价与固定电价的差异。</w:t>
+        <w:t>，并需评估"电价信息何时可知"对费用的影响。图 21 先刻画波动电价与固定电价的差异。</w:t>
       </w:r>
     </w:p>
     <w:p>
       <w:pPr>
-        <w:keepNext/>
+        <w:keepNext w:val="1"/>
         <w:ind w:firstLine="0"/>
         <w:jc w:val="center"/>
       </w:pPr>
       <w:r>
         <w:drawing>
           <wp:inline xmlns:a="http://schemas.openxmlformats.org/drawingml/2006/main" xmlns:pic="http://schemas.openxmlformats.org/drawingml/2006/picture">
-            <wp:extent cx="5265000" cy="3861000"/>
-            <wp:docPr id="20" name="Picture 20"/>
+            <wp:extent cx="5400000" cy="3700899"/>
+            <wp:docPr id="20" name="Picture 20" descr="月均日内峰谷位置随月份漂移；不是概率分布图"/>
             <wp:cNvGraphicFramePr>
               <a:graphicFrameLocks noChangeAspect="1"/>
             </wp:cNvGraphicFramePr>
@@ -11494,7 +11426,7 @@
                   <pic:spPr>
                     <a:xfrm>
                       <a:off x="0" y="0"/>
-                      <a:ext cx="5265000" cy="3861000"/>
+                      <a:ext cx="5400000" cy="3700899"/>
                     </a:xfrm>
                     <a:prstGeom prst="rect"/>
                   </pic:spPr>
@@ -11517,7 +11449,7 @@
           <w:rFonts w:ascii="宋体" w:hAnsi="宋体" w:eastAsia="宋体"/>
           <w:sz w:val="18"/>
         </w:rPr>
-        <w:t xml:space="preserve">图 22 波动电价逐月日内曲线</w:t>
+        <w:t>图 21 逐月电价与固定基准对照</w:t>
       </w:r>
     </w:p>
     <w:p>
@@ -11527,7 +11459,7 @@
           <w:rFonts w:ascii="宋体" w:hAnsi="宋体" w:eastAsia="宋体"/>
           <w:sz w:val="21"/>
         </w:rPr>
-        <w:t xml:space="preserve">以山脊图叠放附件 4 各月的平均日内电价曲线（逐月基线上移 0.30 元/kWh，图 22），橙色虚线为附件 1 固定电价作同尺度参照。波动电价全年区间 </w:t>
+        <w:t xml:space="preserve">图 21 将附件 4 十二个月的平均日内电价分别绘于统一坐标面板，蓝色实线为月均电价，橙色虚线为附件 1 固定基准；各面板不作纵向平移，可直接比较绝对水平。波动电价全年区间 </w:t>
       </w:r>
       <m:oMath>
         <m:d>
@@ -11579,12 +11511,12 @@
           <w:rFonts w:ascii="宋体" w:hAnsi="宋体" w:eastAsia="宋体"/>
           <w:sz w:val="21"/>
         </w:rPr>
-        <w:t xml:space="preserve"> 更宽；且峰谷位置逐月漂移，夏季高价带明显加宽并向傍晚偏移。这意味着固定电价"同一时段永远同价"的假设不再成立，储能套利的时机也随日变化。价格的时空结构可由 Hovmöller 图进一步展开（图 23）。</w:t>
+        <w:t xml:space="preserve"> 更宽；且峰谷位置逐月漂移，夏季高价带明显加宽并向傍晚偏移。这意味着固定电价"同一时段永远同价"的假设不再成立，储能套利的时机也随日变化。价格的时空结构可由 Hovmöller 图进一步展开（图 22）。</w:t>
       </w:r>
     </w:p>
     <w:p>
       <w:pPr>
-        <w:keepNext/>
+        <w:keepNext w:val="1"/>
         <w:ind w:firstLine="0"/>
         <w:jc w:val="center"/>
       </w:pPr>
@@ -11592,7 +11524,7 @@
         <w:drawing>
           <wp:inline xmlns:a="http://schemas.openxmlformats.org/drawingml/2006/main" xmlns:pic="http://schemas.openxmlformats.org/drawingml/2006/picture">
             <wp:extent cx="5265000" cy="3159000"/>
-            <wp:docPr id="21" name="Picture 21"/>
+            <wp:docPr id="21" name="Picture 21" descr="高价带沿季节和日内峰段形成可追踪结构"/>
             <wp:cNvGraphicFramePr>
               <a:graphicFrameLocks noChangeAspect="1"/>
             </wp:cNvGraphicFramePr>
@@ -11635,7 +11567,7 @@
           <w:rFonts w:ascii="宋体" w:hAnsi="宋体" w:eastAsia="宋体"/>
           <w:sz w:val="18"/>
         </w:rPr>
-        <w:t xml:space="preserve">图 23 波动电价日期时刻热图</w:t>
+        <w:t>图 22 波动电价日期时刻热图</w:t>
       </w:r>
     </w:p>
     <w:p>
@@ -11645,7 +11577,7 @@
           <w:rFonts w:ascii="宋体" w:hAnsi="宋体" w:eastAsia="宋体"/>
           <w:sz w:val="21"/>
         </w:rPr>
-        <w:t xml:space="preserve">图 23 左图把 365 天 ×144 段电价铺成日期-时刻热图，右图为逐日日内价差。价格高值带在夏季（约第 150–240 天）显著加宽并向傍晚延伸，与图 22 的季节漂移一致；右图显示多数日份的日内价差高于附件 1 的 1.024 元/kWh，全年均值升到 1.099 元/kWh。价差扩大与储能循环量上升方向一致，但固定与波动电价数据中的均值、价差和时变结构同时变化，因此不能把循环量或费用变化仅归因于某一个电价特征。</w:t>
+        <w:t>图 22 左图把 365 天 ×144 段电价铺成日期-时刻热图，右图为逐日日内价差。价格高值带在夏季（约第 150–240 天）显著加宽并向傍晚延伸，与图 21 的季节漂移一致；右图显示多数日份的日内价差高于附件 1 的 1.024 元/kWh，全年均值升到 1.099 元/kWh。价差扩大与储能循环量上升方向一致，但固定与波动电价数据中的均值、价差和时变结构同时变化，因此不能把循环量或费用变化仅归因于某一个电价特征。</w:t>
       </w:r>
     </w:p>
     <w:p>
@@ -11956,12 +11888,12 @@
           <w:rFonts w:ascii="宋体" w:hAnsi="宋体" w:eastAsia="宋体"/>
           <w:sz w:val="21"/>
         </w:rPr>
-        <w:t xml:space="preserve">在同一 334 天范围下，把问题二/三（固定电价）与问题四（波动电价）逐项对照，如图 24。</w:t>
+        <w:t>在同一 334 天范围下，把问题二/三（固定电价）与问题四（波动电价）逐项对照，如图 23。</w:t>
       </w:r>
     </w:p>
     <w:p>
       <w:pPr>
-        <w:keepNext/>
+        <w:keepNext w:val="1"/>
         <w:ind w:firstLine="0"/>
         <w:jc w:val="center"/>
       </w:pPr>
@@ -11969,7 +11901,7 @@
         <w:drawing>
           <wp:inline xmlns:a="http://schemas.openxmlformats.org/drawingml/2006/main" xmlns:pic="http://schemas.openxmlformats.org/drawingml/2006/picture">
             <wp:extent cx="5265000" cy="2983500"/>
-            <wp:docPr id="22" name="Picture 22"/>
+            <wp:docPr id="22" name="Picture 22" descr="价格波动改变成本结构但不推翻滚动策略优势"/>
             <wp:cNvGraphicFramePr>
               <a:graphicFrameLocks noChangeAspect="1"/>
             </wp:cNvGraphicFramePr>
@@ -12012,7 +11944,7 @@
           <w:rFonts w:ascii="宋体" w:hAnsi="宋体" w:eastAsia="宋体"/>
           <w:sz w:val="18"/>
         </w:rPr>
-        <w:t xml:space="preserve">图 24 固定与波动电价指标对照</w:t>
+        <w:t>图 23 固定与波动电价指标对照</w:t>
       </w:r>
     </w:p>
     <w:p>
@@ -12178,12 +12110,12 @@
           <w:rFonts w:ascii="宋体" w:hAnsi="宋体" w:eastAsia="宋体"/>
           <w:sz w:val="21"/>
         </w:rPr>
-        <w:t xml:space="preserve"> 是在适应性与稳定性之间折中，而不是笼统认为窗口越长越能跟踪季节漂移。光伏预报的提前期效应更为显著（图 25）。</w:t>
+        <w:t xml:space="preserve"> 是在适应性与稳定性之间折中，而不是笼统认为窗口越长越能跟踪季节漂移。光伏预报的提前期效应更为显著（图 24）。</w:t>
       </w:r>
     </w:p>
     <w:p>
       <w:pPr>
-        <w:keepNext/>
+        <w:keepNext w:val="1"/>
         <w:ind w:firstLine="0"/>
         <w:jc w:val="center"/>
       </w:pPr>
@@ -12191,7 +12123,7 @@
         <w:drawing>
           <wp:inline xmlns:a="http://schemas.openxmlformats.org/drawingml/2006/main" xmlns:pic="http://schemas.openxmlformats.org/drawingml/2006/picture">
             <wp:extent cx="5265000" cy="2895750"/>
-            <wp:docPr id="23" name="Picture 23"/>
+            <wp:docPr id="23" name="Picture 23" descr="长提前期误差总体更大，局部有回落；不声称严格单调"/>
             <wp:cNvGraphicFramePr>
               <a:graphicFrameLocks noChangeAspect="1"/>
             </wp:cNvGraphicFramePr>
@@ -12234,7 +12166,7 @@
           <w:rFonts w:ascii="宋体" w:hAnsi="宋体" w:eastAsia="宋体"/>
           <w:sz w:val="18"/>
         </w:rPr>
-        <w:t xml:space="preserve">图 25 光伏预报误差随提前期变化</w:t>
+        <w:t>图 24 光伏预报误差随提前期变化</w:t>
       </w:r>
     </w:p>
     <w:p>
@@ -12244,7 +12176,7 @@
           <w:rFonts w:ascii="宋体" w:hAnsi="宋体" w:eastAsia="宋体"/>
           <w:sz w:val="21"/>
         </w:rPr>
-        <w:t xml:space="preserve">汇总附件 3 全年全部发布时刻、对齐附件 2 实际功率后的光伏预报 MAE 随提前期变化（图 25），可见误差随提前期总体放大。提前 1 h 的 MAE 为 18.69 kW，提前 24 h 达 374.79 kW。0:00、6:00、12:00 对午后目标时段的汇总 MAE 分别约为 181.97、121.94、65.68 kW，与“越临近通常越准”的方向一致。敏感度分析用于检查结果对设定的响应，不能替代独立测试集上的验证。</w:t>
+        <w:t>汇总附件 3 全年全部发布时刻、对齐附件 2 实际功率后的光伏预报 MAE 随提前期变化（图 24），可见误差随提前期总体放大。提前 1 h 的 MAE 为 18.69 kW，提前 24 h 达 374.79 kW。0:00、6:00、12:00 对午后目标时段的汇总 MAE 分别约为 181.97、121.94、65.68 kW，与“越临近通常越准”的方向一致。敏感度分析用于检查结果对设定的响应，不能替代独立测试集上的验证。</w:t>
       </w:r>
     </w:p>
     <w:p>
@@ -12381,10 +12313,20 @@
       <w:pPr/>
       <w:r>
         <w:rPr>
+          <w:rFonts w:ascii="宋体" w:hAnsi="宋体" w:eastAsia="宋体"/>
+          <w:sz w:val="21"/>
+        </w:rPr>
+        <w:t>分季节看，相对内部 S0 的节省依次为冬季 9.97 万、春季 16.79 万、夏季 24.80 万、秋季 10.62 万元；相对 Q2 分别为 11.28 万、12.71 万、23.02 万、9.72 万元，四季合计与全年差额一致。以实际日净用能的 95% 分位数 87196.12 kWh 为阈值定义 17 个极端日，S1 相对内部 S0 与 Q2 分别节省 1.55 万和 2.28 万元，但极端日逐日胜率仅为 64.7% 和 70.6%。因此可说交付期总体改善较稳定，不能说每个普通日或极端日都占优。</w:t>
+      </w:r>
+    </w:p>
+    <w:p>
+      <w:pPr/>
+      <w:r>
+        <w:rPr>
           <w:rFonts w:ascii="Times New Roman" w:eastAsia="宋体"/>
           <w:sz w:val="22"/>
         </w:rPr>
-        <w:t>图 26(a) 将已计算的 7 日循环移动块自助区间与总节省并列，(b) 按交付日期累计逐日配对费用差。两条曲线分别使用 Q3 内部 S0 和 Q2 场景规划作为基线，局部回落表示当日滚动策略费用更高。参数选择与评价共用本交付期，这些区间不代表独立测试集上的保证。</w:t>
+        <w:t>图 25 将上述统计结果可视化：上面板给出总节省及 7 日循环移动块自助 95% 区间，下图分别汇总四季的节省。蓝色与灰色始终对应 Q3 内部 S0 和 Q2 两种比较基线。四季天数不同，柱高表示期间总量；区间支持同期总体改善，不表示每日均占优，也不替代独立样本外验证。</w:t>
       </w:r>
     </w:p>
     <w:p>
@@ -12396,8 +12338,8 @@
       <w:r>
         <w:drawing>
           <wp:inline xmlns:a="http://schemas.openxmlformats.org/drawingml/2006/main" xmlns:pic="http://schemas.openxmlformats.org/drawingml/2006/picture">
-            <wp:extent cx="5400000" cy="3396774"/>
-            <wp:docPr id="27" name="fig_rolling_benefit_uncertainty" descr="滚动策略的配对收益区间与累计节省"/>
+            <wp:extent cx="5400000" cy="3289688"/>
+            <wp:docPr id="26" name="Picture 1" descr="总收益区间与分季节收益不等于逐日占优"/>
             <wp:cNvGraphicFramePr>
               <a:graphicFrameLocks noChangeAspect="1"/>
             </wp:cNvGraphicFramePr>
@@ -12409,7 +12351,7 @@
                     <pic:cNvPicPr/>
                   </pic:nvPicPr>
                   <pic:blipFill>
-                    <a:blip r:embed="rIdV3Figure26"/>
+                    <a:blip r:embed="rIdRefresh25"/>
                     <a:stretch>
                       <a:fillRect/>
                     </a:stretch>
@@ -12417,7 +12359,7 @@
                   <pic:spPr>
                     <a:xfrm>
                       <a:off x="0" y="0"/>
-                      <a:ext cx="5400000" cy="3396774"/>
+                      <a:ext cx="5400000" cy="3289688"/>
                     </a:xfrm>
                     <a:prstGeom prst="rect"/>
                   </pic:spPr>
@@ -12434,24 +12376,13 @@
         <w:spacing w:after="100"/>
         <w:ind w:firstLine="0"/>
         <w:jc w:val="center"/>
-        <w:keepNext w:val="0"/>
       </w:pPr>
       <w:r>
         <w:rPr>
           <w:rFonts w:ascii="Times New Roman" w:eastAsia="宋体"/>
           <w:sz w:val="20"/>
         </w:rPr>
-        <w:t>图 26 滚动策略的配对收益区间与累计节省</w:t>
-      </w:r>
-    </w:p>
-    <w:p>
-      <w:pPr/>
-      <w:r>
-        <w:rPr>
-          <w:rFonts w:ascii="宋体" w:hAnsi="宋体" w:eastAsia="宋体"/>
-          <w:sz w:val="21"/>
-        </w:rPr>
-        <w:t>分季节看，相对内部 S0 的节省依次为冬季 9.97 万、春季 16.79 万、夏季 24.80 万、秋季 10.62 万元；相对 Q2 分别为 11.28 万、12.71 万、23.02 万、9.72 万元，四季合计与全年差额一致。以实际日净用能的 95% 分位数 87196.12 kWh 为阈值定义 17 个极端日，S1 相对内部 S0 与 Q2 分别节省 1.55 万和 2.28 万元，但极端日逐日胜率仅为 64.7% 和 70.6%。因此可说交付期总体改善较稳定，不能说每个普通日或极端日都占优。</w:t>
+        <w:t>图 25 滚动策略收益区间与季节分解</w:t>
       </w:r>
     </w:p>
     <w:p>
@@ -12474,20 +12405,20 @@
           <w:rFonts w:ascii="宋体" w:hAnsi="宋体" w:eastAsia="宋体"/>
           <w:sz w:val="21"/>
         </w:rPr>
-        <w:t xml:space="preserve">为降低求解与回算共用中间量带来的错误风险，结果导出后由约束审计脚本重新读取逐时段结果，其模块结构如图 27。</w:t>
+        <w:t>为降低求解与回算共用中间量带来的错误风险，结果导出后由约束审计脚本重新读取逐时段结果，其模块结构如图 26。</w:t>
       </w:r>
     </w:p>
     <w:p>
       <w:pPr>
-        <w:keepNext/>
+        <w:keepNext w:val="1"/>
         <w:ind w:firstLine="0"/>
         <w:jc w:val="center"/>
       </w:pPr>
       <w:r>
         <w:drawing>
           <wp:inline xmlns:a="http://schemas.openxmlformats.org/drawingml/2006/main" xmlns:pic="http://schemas.openxmlformats.org/drawingml/2006/picture">
-            <wp:extent cx="5592898" cy="2757609"/>
-            <wp:docPr id="24" name="Picture 24"/>
+            <wp:extent cx="5400000" cy="2190000"/>
+            <wp:docPr id="24" name="Picture 24" descr="模块化实现使四问共享同一组参数和约束口径"/>
             <wp:cNvGraphicFramePr>
               <a:graphicFrameLocks noChangeAspect="1"/>
             </wp:cNvGraphicFramePr>
@@ -12507,7 +12438,7 @@
                   <pic:spPr>
                     <a:xfrm>
                       <a:off x="0" y="0"/>
-                      <a:ext cx="5592898" cy="2757609"/>
+                      <a:ext cx="5400000" cy="2190000"/>
                     </a:xfrm>
                     <a:prstGeom prst="rect"/>
                   </pic:spPr>
@@ -12530,7 +12461,7 @@
           <w:rFonts w:ascii="宋体" w:hAnsi="宋体" w:eastAsia="宋体"/>
           <w:sz w:val="18"/>
         </w:rPr>
-        <w:t xml:space="preserve">图 27 求解程序模块依赖</w:t>
+        <w:t>图 26 求解导出与交叉回算流程</w:t>
       </w:r>
     </w:p>
     <w:p>
@@ -12540,7 +12471,7 @@
           <w:rFonts w:ascii="宋体" w:hAnsi="宋体" w:eastAsia="宋体"/>
           <w:sz w:val="21"/>
         </w:rPr>
-        <w:t xml:space="preserve">图 27 显示，参数模块集中定义储能容量、功率、效率与时间步长；数据摄入检查行数和日期；求解层装配线性约束；回算层从导出的 Excel 逐时段表复算供需平衡等式、SOC 递推及上下界、跨日连续、年初一次性初值、年末 SOC、充放电功率、弃光非负、单位换算和 </w:t>
+        <w:t xml:space="preserve">图 26 显示，参数模块集中定义储能容量、功率、效率与时间步长；数据摄入检查行数和日期；求解层装配线性约束；回算层从导出的 Excel 逐时段表复算供需平衡等式、SOC 递推及上下界、跨日连续、年初一次性初值、年末 SOC、充放电功率、弃光非负、单位换算和 </w:t>
       </w:r>
       <m:oMath>
         <m:sSub>

</xml_diff>